<commit_message>
feat: Signed carry-forward, Aspose JAR PDF, logging fixes, README rewrite, opencode_logs
</commit_message>
<xml_diff>
--- a/templates/Logsheet_Template.docx
+++ b/templates/Logsheet_Template.docx
@@ -1847,6 +1847,8 @@
           <w:szCs w:val="32"/>
         </w:rPr>
       </w:pPr>
+      <w:bookmarkStart w:id="0" w:name="_GoBack"/>
+      <w:bookmarkEnd w:id="0"/>
     </w:p>
     <w:tbl>
       <w:tblPr>
@@ -2686,15 +2688,6 @@
                 <w:szCs w:val="32"/>
               </w:rPr>
             </w:pPr>
-            <w:r>
-              <w:rPr>
-                <w:rFonts w:ascii="SutonnyMJ" w:hAnsi="SutonnyMJ" w:cs="SutonnyMJ"/>
-                <w:b/>
-                <w:sz w:val="32"/>
-                <w:szCs w:val="32"/>
-              </w:rPr>
-              <w:t>2,167/-</w:t>
-            </w:r>
           </w:p>
         </w:tc>
         <w:tc>
@@ -6158,8 +6151,6 @@
           <w:szCs w:val="32"/>
         </w:rPr>
       </w:pPr>
-      <w:bookmarkStart w:id="0" w:name="_GoBack"/>
-      <w:bookmarkEnd w:id="0"/>
     </w:p>
     <w:tbl>
       <w:tblPr>
@@ -8205,7 +8196,7 @@
 </file>
 
 <file path=customXml/itemProps1.xml><?xml version="1.0" encoding="utf-8"?>
-<ds:datastoreItem xmlns:ds="http://schemas.openxmlformats.org/officeDocument/2006/customXml" ds:itemID="{2CA4E4BF-9652-4755-8186-43B6F7CAE77A}">
+<ds:datastoreItem xmlns:ds="http://schemas.openxmlformats.org/officeDocument/2006/customXml" ds:itemID="{5A679154-CE6C-422D-940F-370B9ABA5C3B}">
   <ds:schemaRefs>
     <ds:schemaRef ds:uri="http://schemas.openxmlformats.org/officeDocument/2006/bibliography"/>
   </ds:schemaRefs>

</xml_diff>